<commit_message>
Registration form: keep to one page after goal update
Co-Authored-By: Claude Opus 5.5 <noreply@anthropic.com>
Claude-Session: https://claude.ai/code/session_01Y8nwRoGGkpvv5bRhdRQxFV
</commit_message>
<xml_diff>
--- a/docs/Registravimo-lapas_Gabriele-Tamaseviciute.docx
+++ b/docs/Registravimo-lapas_Gabriele-Tamaseviciute.docx
@@ -235,7 +235,6 @@
     <w:p>
       <w:pPr>
         <w:rPr>
-          <w:bCs/>
           <w:lang w:val="lt-LT"/>
         </w:rPr>
       </w:pPr>
@@ -472,42 +471,6 @@
             <w:tcBorders>
               <w:top w:val="single" w:sz="4" w:space="0" w:color="auto"/>
               <w:bottom w:val="single" w:sz="4" w:space="0" w:color="auto"/>
-            </w:tcBorders>
-            <w:vAlign w:val="bottom"/>
-          </w:tcPr>
-          <w:p>
-            <w:pPr>
-              <w:rPr>
-                <w:bCs/>
-                <w:lang w:val="lt-LT"/>
-              </w:rPr>
-            </w:pPr>
-          </w:p>
-        </w:tc>
-      </w:tr>
-      <w:tr>
-        <w:trPr>
-          <w:cantSplit/>
-          <w:trHeight w:val="340"/>
-        </w:trPr>
-        <w:tc>
-          <w:tcPr>
-            <w:tcW w:w="3402" w:type="dxa"/>
-            <w:vAlign w:val="bottom"/>
-          </w:tcPr>
-          <w:p>
-            <w:pPr>
-              <w:rPr>
-                <w:lang w:val="lt-LT"/>
-              </w:rPr>
-            </w:pPr>
-          </w:p>
-        </w:tc>
-        <w:tc>
-          <w:tcPr>
-            <w:tcW w:w="6855" w:type="dxa"/>
-            <w:tcBorders>
-              <w:top w:val="single" w:sz="4" w:space="0" w:color="auto"/>
             </w:tcBorders>
             <w:vAlign w:val="bottom"/>
           </w:tcPr>

</xml_diff>